<commit_message>
Finalize deliverables with AGV sensitivity re-measurements and doc sync.
Update PPT slide 10 from 15/20/25/35 AGV runs, align report and manual with final KPIs, and add scripts that preserve PPT formatting when editing.

Co-authored-by: Cursor <cursoragent@cursor.com>
</commit_message>
<xml_diff>
--- a/제23회한국대학생컴퓨터시뮬레이션경진대회_인하이트사용자매뉴얼.docx
+++ b/제23회한국대학생컴퓨터시뮬레이션경진대회_인하이트사용자매뉴얼.docx
@@ -1184,7 +1184,7 @@
           <w:szCs w:val="24"/>
           <w:lang w:eastAsia="ko-KR"/>
         </w:rPr>
-        <w:t>③ 상단 ▶ Run 버튼 클릭 → Simulation 실험 선택 → 실행</w:t>
+        <w:t>③ 상단 ▶ Run 버튼 클릭 → Simulation 실험 선택 → 실행 (Final time 18,000초) (Final time 18,000초) (Final time 18,000초) (Final time 18,000초) (Final time 18,000초) (Final time 18,000초) (Final time 18,000초)</w:t>
       </w:r>
     </w:p>
     <w:p>
@@ -1525,7 +1525,7 @@
                 <w:szCs w:val="24"/>
                 <w:lang w:eastAsia="ko-KR"/>
               </w:rPr>
-              <w:t>25~35</w:t>
+              <w:t>15~35 (최적 25)</w:t>
             </w:r>
           </w:p>
         </w:tc>
@@ -1551,7 +1551,7 @@
                 <w:szCs w:val="24"/>
                 <w:lang w:eastAsia="ko-KR"/>
               </w:rPr>
-              <w:t>AGV 운용 대수 (민감도 분석 핵심)</w:t>
+              <w:t>AGV 운용 대수 (민감도: 15·20·25·35 실험, 기준 25)</w:t>
             </w:r>
           </w:p>
         </w:tc>

</xml_diff>